<commit_message>
updated network assignment and quizzes
</commit_message>
<xml_diff>
--- a/quizzes/Quiz_09.docx
+++ b/quizzes/Quiz_09.docx
@@ -6,11 +6,13 @@
       <w:pPr>
         <w:rPr>
           <w:b w:val="1"/>
+          <w:bCs w:val="1"/>
         </w:rPr>
       </w:pPr>
       <w:r>
         <w:rPr>
           <w:b w:val="1"/>
+          <w:bCs w:val="1"/>
           <w:rtl w:val="0"/>
         </w:rPr>
         <w:t xml:space="preserve">Quiz 9</w:t>
@@ -287,7 +289,7 @@
         <w:rPr>
           <w:rtl w:val="0"/>
         </w:rPr>
-        <w:t xml:space="preserve">List one factor that might cause an Allee effect (a.k.a. positive density dependence)</w:t>
+        <w:t xml:space="preserve">List one factor that might cause an Allee effect (a.k.a. positive density dependence).</w:t>
       </w:r>
     </w:p>
     <w:p>
@@ -592,11 +594,19 @@
       </w:pPr>
     </w:pPrDefault>
   </w:docDefaults>
+  <w:style w:type="table" w:styleId="TableNormal" w:default="1">
+    <w:name w:val="TableNormal"/>
+    <w:tblPr>
+      <w:tblCellMar>
+        <w:top w:w="100.0" w:type="dxa"/>
+        <w:left w:w="100.0" w:type="dxa"/>
+        <w:bottom w:w="100.0" w:type="dxa"/>
+        <w:right w:w="100.0" w:type="dxa"/>
+      </w:tblCellMar>
+    </w:tblPr>
+  </w:style>
   <w:style w:type="paragraph" w:styleId="Normal" w:default="1">
     <w:name w:val="normal"/>
-  </w:style>
-  <w:style w:type="table" w:styleId="TableNormal" w:default="1">
-    <w:name w:val="Table Normal"/>
   </w:style>
   <w:style w:type="paragraph" w:styleId="Heading1">
     <w:name w:val="heading 1"/>
@@ -625,6 +635,7 @@
     </w:pPr>
     <w:rPr>
       <w:b w:val="0"/>
+      <w:bCs w:val="0"/>
       <w:sz w:val="32"/>
       <w:szCs w:val="32"/>
     </w:rPr>
@@ -641,6 +652,7 @@
     </w:pPr>
     <w:rPr>
       <w:b w:val="0"/>
+      <w:bCs w:val="0"/>
       <w:color w:val="434343"/>
       <w:sz w:val="28"/>
       <w:szCs w:val="28"/>
@@ -690,6 +702,7 @@
     </w:pPr>
     <w:rPr>
       <w:i w:val="1"/>
+      <w:iCs w:val="1"/>
       <w:color w:val="666666"/>
       <w:sz w:val="22"/>
       <w:szCs w:val="22"/>
@@ -723,6 +736,7 @@
     <w:rPr>
       <w:rFonts w:ascii="Arial" w:cs="Arial" w:eastAsia="Arial" w:hAnsi="Arial"/>
       <w:i w:val="0"/>
+      <w:iCs w:val="0"/>
       <w:color w:val="666666"/>
       <w:sz w:val="30"/>
       <w:szCs w:val="30"/>

</xml_diff>